<commit_message>
docs(explainer): briefing v0.3 - real taxonomy, 50k numbers, no families, no GRIP
</commit_message>
<xml_diff>
--- a/apps/explainer/public/docs/seen-but-not-grasped-briefing.docx
+++ b/apps/explainer/public/docs/seen-but-not-grasped-briefing.docx
@@ -17,7 +17,7 @@
     </w:p>
     <w:p>
       <w:r>
-        <w:t>Version 0.2  ·  18 October 2026</w:t>
+        <w:t>Version 0.3  ·  18 October 2026</w:t>
       </w:r>
     </w:p>
     <w:p>
@@ -40,7 +40,7 @@
     </w:p>
     <w:p>
       <w:r>
-        <w:t>Seen but Not Grasped is a benchmark of 5,000 real-world photographs. Each image carries five questions, and every question can be answered from the photograph alone. The questions are designed to be easy for a person and difficult for a model: a count under clutter, the text on a sign, or which of two cups sits on the left.</w:t>
+        <w:t>Seen but Not Grasped is a benchmark on a dataset of 50,000 real-world photographs, with about five questions per image across the set. Each question is answerable from the photograph alone, and each is designed to be easy for a person and difficult for a model: a count under clutter, the text on a sign, or which of two cups sits on the left.</w:t>
       </w:r>
     </w:p>
     <w:p>
@@ -50,7 +50,7 @@
     </w:p>
     <w:p>
       <w:r>
-        <w:t>The dataset is assembled in tiers. 500 images are hand-selected and hand-annotated by the team. 4,500 more are generated by a model we fine-tune ourselves, and every generated item is reviewed by a person before it enters the set. The wider 50,000-image corpus is planned for public release on Hugging Face.</w:t>
+        <w:t>Every question is drafted by an open model the team runs itself (Gemma 4 31B, on the group's own cluster) and then reviewed and picked by people; no unreviewed item is ever admitted. 5,000 hand-picked images form the curated benchmark, and the remaining 45,000 images stay open for the community to contribute to.</w:t>
       </w:r>
     </w:p>
     <w:p>
@@ -114,7 +114,7 @@
           </w:tcPr>
           <w:p>
             <w:r>
-              <w:t>5,000</w:t>
+              <w:t>50,000</w:t>
             </w:r>
           </w:p>
         </w:tc>
@@ -124,7 +124,7 @@
           </w:tcPr>
           <w:p>
             <w:r>
-              <w:t>benchmark images, all real photographs</w:t>
+              <w:t>photographs in the dataset; questions are drafted across all of them</w:t>
             </w:r>
           </w:p>
         </w:tc>
@@ -136,7 +136,7 @@
           </w:tcPr>
           <w:p>
             <w:r>
-              <w:t>500</w:t>
+              <w:t>5,000</w:t>
             </w:r>
           </w:p>
         </w:tc>
@@ -146,7 +146,7 @@
           </w:tcPr>
           <w:p>
             <w:r>
-              <w:t>hand-selected; five questions written by the team for each</w:t>
+              <w:t>hand-picked images in the curated benchmark</w:t>
             </w:r>
           </w:p>
         </w:tc>
@@ -158,7 +158,7 @@
           </w:tcPr>
           <w:p>
             <w:r>
-              <w:t>4,500</w:t>
+              <w:t>45,000</w:t>
             </w:r>
           </w:p>
         </w:tc>
@@ -168,7 +168,7 @@
           </w:tcPr>
           <w:p>
             <w:r>
-              <w:t>generated by an open model, reviewed item by item before admission</w:t>
+              <w:t>images open for community contribution</w:t>
             </w:r>
           </w:p>
         </w:tc>
@@ -190,7 +190,7 @@
           </w:tcPr>
           <w:p>
             <w:r>
-              <w:t>question–answer pairs in the final benchmark</w:t>
+              <w:t>reviewed question–answer pairs in the benchmark</w:t>
             </w:r>
           </w:p>
         </w:tc>
@@ -202,7 +202,7 @@
           </w:tcPr>
           <w:p>
             <w:r>
-              <w:t>6</w:t>
+              <w:t>L1–L5</w:t>
             </w:r>
           </w:p>
         </w:tc>
@@ -212,7 +212,7 @@
           </w:tcPr>
           <w:p>
             <w:r>
-              <w:t>question families, each with a fixed protocol</w:t>
+              <w:t>the reasoning level recorded on every item</w:t>
             </w:r>
           </w:p>
         </w:tc>
@@ -224,7 +224,7 @@
           </w:tcPr>
           <w:p>
             <w:r>
-              <w:t>50,000</w:t>
+              <w:t>D1–D11</w:t>
             </w:r>
           </w:p>
         </w:tc>
@@ -234,7 +234,7 @@
           </w:tcPr>
           <w:p>
             <w:r>
-              <w:t>corpus for public release on Hugging Face</w:t>
+              <w:t>the scene domains recorded on every image</w:t>
             </w:r>
           </w:p>
         </w:tc>
@@ -242,7 +242,7 @@
     </w:tbl>
     <w:p>
       <w:r>
-        <w:t>The set is built in seven steps, in this order:</w:t>
+        <w:t>The set is built in six steps, in this order:</w:t>
       </w:r>
     </w:p>
     <w:p>
@@ -250,7 +250,7 @@
         <w:pStyle w:val="ListNumber"/>
       </w:pPr>
       <w:r>
-        <w:t>Select the 500. A rarity-stratified, logged choice, so that no band of the corpus dominates.</w:t>
+        <w:t>Draft across the dataset. Gemma 4 31B drafts candidate questions for photographs across the whole corpus.</w:t>
       </w:r>
     </w:p>
     <w:p>
@@ -258,7 +258,7 @@
         <w:pStyle w:val="ListNumber"/>
       </w:pPr>
       <w:r>
-        <w:t>Write five questions per image. One capability per question, with ground truth and a recorded reason for every exclusion.</w:t>
+        <w:t>Tag every candidate. Each candidate carries its capability code, its reasoning level and the image's scene domain.</w:t>
       </w:r>
     </w:p>
     <w:p>
@@ -266,7 +266,7 @@
         <w:pStyle w:val="ListNumber"/>
       </w:pPr>
       <w:r>
-        <w:t>Fine-tune an open model on the hand-written set. The 500 × 5 authored items become its training data.</w:t>
+        <w:t>Review and pick. People review candidates and pick the ones that enter the benchmark. 5,000 hand-picked images form the curated set.</w:t>
       </w:r>
     </w:p>
     <w:p>
@@ -274,7 +274,7 @@
         <w:pStyle w:val="ListNumber"/>
       </w:pPr>
       <w:r>
-        <w:t>Generate questions across the wider corpus. The fine-tuned model drafts items for the remaining photographs.</w:t>
+        <w:t>Fix up. Editors repair wording and ground truth. No item enters the set unreviewed.</w:t>
       </w:r>
     </w:p>
     <w:p>
@@ -282,15 +282,7 @@
         <w:pStyle w:val="ListNumber"/>
       </w:pPr>
       <w:r>
-        <w:t>Select 4,500 more by a fixed rule. A pre-declared, seeded allocation picks the images. Question quality is a fixup gate, never a selection criterion.</w:t>
-      </w:r>
-    </w:p>
-    <w:p>
-      <w:pPr>
-        <w:pStyle w:val="ListNumber"/>
-      </w:pPr>
-      <w:r>
-        <w:t>Fix up and verify everything generated. No item enters the set unreviewed.</w:t>
+        <w:t>Leave the rest open. The remaining 45,000 images stay open for the community to contribute to.</w:t>
       </w:r>
     </w:p>
     <w:p>
@@ -303,7 +295,7 @@
     </w:p>
     <w:p>
       <w:r>
-        <w:t>Two rules are fixed before any work starts: image selection for the second tier follows the pre-declared allocation rather than editorial judgement, and no generated item is admitted without human review.</w:t>
+        <w:t>One rule is fixed before any work starts: the model drafts, and people decide. No item is admitted without a recorded human review.</w:t>
       </w:r>
     </w:p>
     <w:p>
@@ -319,7 +311,7 @@
         <w:pStyle w:val="Caption"/>
       </w:pPr>
       <w:r>
-        <w:t>Table 2. Question families with illustrative examples.</w:t>
+        <w:t>Table 2. The taxonomy: capabilities and reasoning levels.</w:t>
       </w:r>
     </w:p>
     <w:tbl>
@@ -343,7 +335,7 @@
               <w:rPr>
                 <w:b/>
               </w:rPr>
-              <w:t>Family</w:t>
+              <w:t>Group</w:t>
             </w:r>
           </w:p>
         </w:tc>
@@ -356,7 +348,7 @@
               <w:rPr>
                 <w:b/>
               </w:rPr>
-              <w:t>What it tests</w:t>
+              <w:t>Codes</w:t>
             </w:r>
           </w:p>
         </w:tc>
@@ -369,7 +361,7 @@
               <w:rPr>
                 <w:b/>
               </w:rPr>
-              <w:t>Illustrative question</w:t>
+              <w:t>What it asks</w:t>
             </w:r>
           </w:p>
         </w:tc>
@@ -381,7 +373,7 @@
           </w:tcPr>
           <w:p>
             <w:r>
-              <w:t>Counting</w:t>
+              <w:t>Geometry</w:t>
             </w:r>
           </w:p>
         </w:tc>
@@ -391,7 +383,7 @@
           </w:tcPr>
           <w:p>
             <w:r>
-              <w:t>Exact count of objects, often under clutter.</w:t>
+              <w:t>G1–G8</w:t>
             </w:r>
           </w:p>
         </w:tc>
@@ -401,7 +393,7 @@
           </w:tcPr>
           <w:p>
             <w:r>
-              <w:t>How many chairs are on the balcony?</w:t>
+              <w:t>The layout of the scene: depth and occlusion, relative size, shape and structure, lines and angles, viewpoint, spatial layout, symmetry, fit and clearance.</w:t>
             </w:r>
           </w:p>
         </w:tc>
@@ -413,7 +405,7 @@
           </w:tcPr>
           <w:p>
             <w:r>
-              <w:t>Scene text</w:t>
+              <w:t>Physics</w:t>
             </w:r>
           </w:p>
         </w:tc>
@@ -423,7 +415,7 @@
           </w:tcPr>
           <w:p>
             <w:r>
-              <w:t>Reading a sign, plate, receipt, or label in the wild.</w:t>
+              <w:t>P1–P8</w:t>
             </w:r>
           </w:p>
         </w:tc>
@@ -433,7 +425,7 @@
           </w:tcPr>
           <w:p>
             <w:r>
-              <w:t>What does the sign above the shop say?</w:t>
+              <w:t>What would happen and why: material properties, support and stability, contact, load paths, dynamics and prediction, light and shadow, fluids, function.</w:t>
             </w:r>
           </w:p>
         </w:tc>
@@ -445,7 +437,7 @@
           </w:tcPr>
           <w:p>
             <w:r>
-              <w:t>Spatial</w:t>
+              <w:t>Bridge pairs</w:t>
             </w:r>
           </w:p>
         </w:tc>
@@ -455,7 +447,7 @@
           </w:tcPr>
           <w:p>
             <w:r>
-              <w:t>Relative position of two things in the same photo.</w:t>
+              <w:t>B1–B4</w:t>
             </w:r>
           </w:p>
         </w:tc>
@@ -465,7 +457,7 @@
           </w:tcPr>
           <w:p>
             <w:r>
-              <w:t>Is the kettle left or right of the stove?</w:t>
+              <w:t>Geometry and physics asked of the same object, scored as one pair: tipping and balance, shadows as a sun cue, rolling and sliding, passage and collision.</w:t>
             </w:r>
           </w:p>
         </w:tc>
@@ -477,7 +469,7 @@
           </w:tcPr>
           <w:p>
             <w:r>
-              <w:t>Attribute binding</w:t>
+              <w:t>Control</w:t>
             </w:r>
           </w:p>
         </w:tc>
@@ -487,7 +479,7 @@
           </w:tcPr>
           <w:p>
             <w:r>
-              <w:t>Which object carries the property.</w:t>
+              <w:t>PERC</w:t>
             </w:r>
           </w:p>
         </w:tc>
@@ -497,71 +489,7 @@
           </w:tcPr>
           <w:p>
             <w:r>
-              <w:t>Which cup has the red handle?</w:t>
-            </w:r>
-          </w:p>
-        </w:tc>
-      </w:tr>
-      <w:tr>
-        <w:tc>
-          <w:tcPr>
-            <w:tcW w:type="dxa" w:w="2880"/>
-          </w:tcPr>
-          <w:p>
-            <w:r>
-              <w:t>Absent entity</w:t>
-            </w:r>
-          </w:p>
-        </w:tc>
-        <w:tc>
-          <w:tcPr>
-            <w:tcW w:type="dxa" w:w="2880"/>
-          </w:tcPr>
-          <w:p>
-            <w:r>
-              <w:t>Questions about something not in the photo.</w:t>
-            </w:r>
-          </w:p>
-        </w:tc>
-        <w:tc>
-          <w:tcPr>
-            <w:tcW w:type="dxa" w:w="2880"/>
-          </w:tcPr>
-          <w:p>
-            <w:r>
-              <w:t>Is there a bicycle in this picture?</w:t>
-            </w:r>
-          </w:p>
-        </w:tc>
-      </w:tr>
-      <w:tr>
-        <w:tc>
-          <w:tcPr>
-            <w:tcW w:type="dxa" w:w="2880"/>
-          </w:tcPr>
-          <w:p>
-            <w:r>
-              <w:t>Knowledge boundary</w:t>
-            </w:r>
-          </w:p>
-        </w:tc>
-        <w:tc>
-          <w:tcPr>
-            <w:tcW w:type="dxa" w:w="2880"/>
-          </w:tcPr>
-          <w:p>
-            <w:r>
-              <w:t>Needs knowledge beyond the photo; kept in its own scored group.</w:t>
-            </w:r>
-          </w:p>
-        </w:tc>
-        <w:tc>
-          <w:tcPr>
-            <w:tcW w:type="dxa" w:w="2880"/>
-          </w:tcPr>
-          <w:p>
-            <w:r>
-              <w:t>What season do these crops suggest?</w:t>
+              <w:t>Perception-only rungs, kept separate from the reasoning score.</w:t>
             </w:r>
           </w:p>
         </w:tc>
@@ -569,7 +497,7 @@
     </w:tbl>
     <w:p>
       <w:r>
-        <w:t>The illustrative questions demonstrate each family's shape; they are not items from the dataset. Physical reasoning probes (edges, surfaces, support, and scale) sit inside these families, and they are where the benchmark gets its name.</w:t>
+        <w:t>Every item also carries a reasoning level: L1 perception only, L2 one judgement, L3 two linked steps, L4 prediction or counterfactual, L5 multi-step plus outside knowledge. Every image carries one or more scene domains from a closed list of eleven: D1 urban streets and roads, D2 transport hubs and vehicles, D3 architecture and buildings, D4 religious and cultural sites, D5 health and medical settings, D6 engineering, tech and expos, D7 markets, food and retail, D8 indoor home and office, D9 nature and agriculture, D10 crowds and events, D11 industrial and construction. Domains are used for balanced coverage during selection, never for scoring. The physical-reasoning probes (edges, surfaces, support, scale) sit inside these groups, and they are where the benchmark gets its name.</w:t>
       </w:r>
     </w:p>
     <w:p>
@@ -590,7 +518,7 @@
         <w:pStyle w:val="ListBullet"/>
       </w:pPr>
       <w:r>
-        <w:t>Paired accuracy with confidence intervals. Every model answers the same items, and the interval is computed across those items. A paired design requires about 1,440 items to detect a two-point gap; the benchmark holds 5,000 images so every question family and every category clears its own reporting floor.</w:t>
+        <w:t>Paired accuracy with confidence intervals. Every model answers the same items, and the interval is computed across those items. A paired design requires about 1,440 items to detect a two-point gap; the curated set holds 5,000 images so every capability, level and domain clears its own reporting floor.</w:t>
       </w:r>
     </w:p>
     <w:p>
@@ -646,7 +574,7 @@
         <w:pStyle w:val="ListBullet"/>
       </w:pPr>
       <w:r>
-        <w:t>Per-capability floors. No category score is reported from too few items.</w:t>
+        <w:t>Per-capability floors. No capability score is reported from too few items.</w:t>
       </w:r>
     </w:p>
     <w:p>
@@ -716,7 +644,7 @@
     </w:p>
     <w:p>
       <w:r>
-        <w:t>The open-source tier runs on the group's own cluster, fine-tuning included, at no cost. A bounded subset of frontier models runs through APIs. Frontier models are expected to refuse often, and a refusal is a finding we report rather than a reason to leave the model out. The only planned spending in this project is inference on images, and every frontier run is costed before it starts.</w:t>
+        <w:t>The open-source tier runs on the group's own cluster, at no cost. A bounded subset of frontier models runs through APIs. Frontier models are expected to refuse often, and a refusal is a finding we report rather than a reason to leave the model out. The only planned spending in this project is inference on images, and every frontier run is costed before it starts.</w:t>
       </w:r>
     </w:p>
     <w:p>
@@ -748,7 +676,7 @@
         <w:pStyle w:val="ListBullet"/>
       </w:pPr>
       <w:r>
-        <w:t>GRIP (published). The group's geometric-reasoning benchmark, arXiv 2610.16170.</w:t>
+        <w:t>Question drafting (planned). Model-drafted questions across the whole dataset, with human review on every admitted item.</w:t>
       </w:r>
     </w:p>
     <w:p>
@@ -823,26 +751,9 @@
         <w:pStyle w:val="ListBullet"/>
       </w:pPr>
       <w:r>
-        <w:t xml:space="preserve">GRIP (prior work): </w:t>
+        <w:t xml:space="preserve">BBQ-V (related work): </w:t>
       </w:r>
       <w:hyperlink r:id="rId14">
-        <w:r>
-          <w:rPr>
-            <w:color w:val="0563C1"/>
-            <w:u w:val="single"/>
-          </w:rPr>
-          <w:t>https://arxiv.org/abs/2610.16170</w:t>
-        </w:r>
-      </w:hyperlink>
-    </w:p>
-    <w:p>
-      <w:pPr>
-        <w:pStyle w:val="ListBullet"/>
-      </w:pPr>
-      <w:r>
-        <w:t xml:space="preserve">BBQ-V (related work): </w:t>
-      </w:r>
-      <w:hyperlink r:id="rId15">
         <w:r>
           <w:rPr>
             <w:color w:val="0563C1"/>
@@ -859,7 +770,7 @@
       <w:r>
         <w:t xml:space="preserve">They See It, They Don't Get It (earlier real-world stress test): </w:t>
       </w:r>
-      <w:hyperlink r:id="rId16">
+      <w:hyperlink r:id="rId15">
         <w:r>
           <w:rPr>
             <w:color w:val="0563C1"/>
@@ -876,7 +787,7 @@
       <w:r>
         <w:t xml:space="preserve">FaceBench (related work): </w:t>
       </w:r>
-      <w:hyperlink r:id="rId17">
+      <w:hyperlink r:id="rId16">
         <w:r>
           <w:rPr>
             <w:color w:val="0563C1"/>
@@ -893,7 +804,7 @@
       <w:r>
         <w:t xml:space="preserve">PhysBench (related work): </w:t>
       </w:r>
-      <w:hyperlink r:id="rId18">
+      <w:hyperlink r:id="rId17">
         <w:r>
           <w:rPr>
             <w:color w:val="0563C1"/>

</xml_diff>

<commit_message>
docs(explainer): briefing v0.4 - bias (F) and sensitivity (S) codes
</commit_message>
<xml_diff>
--- a/apps/explainer/public/docs/seen-but-not-grasped-briefing.docx
+++ b/apps/explainer/public/docs/seen-but-not-grasped-briefing.docx
@@ -17,7 +17,7 @@
     </w:p>
     <w:p>
       <w:r>
-        <w:t>Version 0.3  ·  18 October 2026</w:t>
+        <w:t>Version 0.4  ·  18 October 2026</w:t>
       </w:r>
     </w:p>
     <w:p>
@@ -501,6 +501,11 @@
       </w:r>
     </w:p>
     <w:p>
+      <w:r>
+        <w:t>Bias probes carry their own axis: F1 race and ethnicity, F2 gender, F3 age, F4 religion and attire, F5 culture and nationality (F rather than B, because B1–B4 is the bridge-pair set; bias probes are scored on their own). The sensitivity flags S1 to S5 (faces not for publication, licence plates, identity documents, home interiors, children) mark images that are flagged and never asked about.</w:t>
+      </w:r>
+    </w:p>
+    <w:p>
       <w:pPr>
         <w:pStyle w:val="Heading1"/>
       </w:pPr>

</xml_diff>